<commit_message>
Tarea 1.2: corrige bitacora e informe docx (aprobacion del plan y entrega al repositorio)
Co-Authored-By: Claude Sonnet 5 <noreply@anthropic.com>
</commit_message>
<xml_diff>
--- a/MAI540_Modulo 1_Tarea 1.2_Laoratorio_Desarrollo_Asistido/Informe_Tarea_1.2_Bitacora.docx
+++ b/MAI540_Modulo 1_Tarea 1.2_Laoratorio_Desarrollo_Asistido/Informe_Tarea_1.2_Bitacora.docx
@@ -126,7 +126,7 @@
         <w:pStyle w:val="ListBullet"/>
       </w:pPr>
       <w:r>
-        <w:t>Paso 3 – Objetivo: obtener un plan antes de programar. Claude propuso un plan de 9 puntos ajustado al README (10 variables, ColumnTransformer, class_weight='balanced', 4 métricas, comparación). Lo revisé y lo aprobé antes de autorizar el código.</w:t>
+        <w:t>Paso 3 – Objetivo: obtener un plan antes de programar. Claude propuso un plan de 9 puntos ajustado al README (10 variables, ColumnTransformer, class_weight='balanced', 4 métricas, comparación). Lo revisé y, una vez revisado, autoricé que se escribiera el código.</w:t>
       </w:r>
     </w:p>
     <w:p>
@@ -134,7 +134,7 @@
         <w:pStyle w:val="ListBullet"/>
       </w:pPr>
       <w:r>
-        <w:t>Instrucción que no funcionó del todo: al principio indiqué «no subas nada aún al repositorio» y luego «vas a subir la tarea al repositorio»; como no se indicó cuál repositorio, Claude no pudo subirlo y dejó la carpeta local lista.</w:t>
+        <w:t>Instrucción sobre la entrega: primero indiqué «no subas nada aún al repositorio» y después pedí subir la tarea al repositorio MAESTRIA IA con un nombre de carpeta concreto y entregar además una copia en la carpeta Módulo 1 con un informe docx. Con esa segunda instrucción, más precisa, Claude localizó el repositorio local y la carpeta, y la subida funcionó.</w:t>
       </w:r>
     </w:p>
     <w:p>
@@ -142,7 +142,7 @@
         <w:pStyle w:val="ListBullet"/>
       </w:pPr>
       <w:r>
-        <w:t>Decisiones que Claude tomó por su cuenta: (a) revisar nulos, rango de sentimiento y proporción de clases; (b) conservar el modelo ANTES dentro del mismo main.py para comparar con el mismo split; (c) guardar el original como main_original.py; (d) reconfigurar la salida a UTF-8 para evitar caracteres corruptos; (e) usar zero_division=0 en precision/recall/F1 para el modelo ANTES.</w:t>
+        <w:t>Decisiones que Claude tomó por su cuenta: (a) revisar nulos, rango de sentimiento y proporción de clases; (b) conservar el modelo ANTES dentro del mismo main.py para comparar con el mismo split; (c) guardar el original como main_original.py; (d) reconfigurar la salida a UTF-8 para evitar caracteres corruptos; (e) usar zero_division=0 en precision/recall/F1 para el modelo ANTES; (f) regenerar DESPUES_salida.txt con codificación limpia (tenía tildes corruptas) tras comprobar que las cifras eran idénticas; (g) al ser rechazado el primer push por commits nuevos en el remoto, integrarlos con pull --rebase (sin forzar) y confirmar el push; (h) subir solo la carpeta de la tarea, sin tocar otros cambios pendientes del repositorio.</w:t>
       </w:r>
     </w:p>
     <w:p>

</xml_diff>